<commit_message>
Fresh cue placements: songs as background, improved line matching
- Reclassify all Music cues as Ambience (BACKGROUND); remove MUSIC UI category
- Clear and regenerate script.json placements from scratch via import heuristics
- Improve placement scoring: trigger phrase match beats scene-heading fallback
- Remove legacy Music playback branch; update README marker docs

Co-authored-by: perekl <perekl@users.noreply.github.com>
</commit_message>
<xml_diff>
--- a/docs/CueBook.docx
+++ b/docs/CueBook.docx
@@ -121,7 +121,7 @@
         <w:t>Jane (Jefferson Starship) - Opening Titles</w:t>
       </w:r>
       <w:r>
-        <w:t xml:space="preserve">  [Music / Critical]</w:t>
+        <w:t xml:space="preserve">  [Ambience / Critical]</w:t>
       </w:r>
     </w:p>
     <w:p>
@@ -137,11 +137,11 @@
         <w:br/>
       </w:r>
       <w:r>
-        <w:t>Duration: Full song excerpt | Loop: No | Fade: In | Vol: 85</w:t>
-      </w:r>
-      <w:r>
-        <w:br/>
-        <w:t>Notes: Licensed. Fade under first scene.</w:t>
+        <w:t>Duration: Full song excerpt | Loop: Yes | Fade: In | Vol: 85</w:t>
+      </w:r>
+      <w:r>
+        <w:br/>
+        <w:t>Notes: Licensed song bed. Fade under first scene.</w:t>
       </w:r>
     </w:p>
     <w:p>
@@ -306,7 +306,7 @@
         <w:t>Jane / Title Music Continue</w:t>
       </w:r>
       <w:r>
-        <w:t xml:space="preserve">  [Music / Critical]</w:t>
+        <w:t xml:space="preserve">  [Ambience / Critical]</w:t>
       </w:r>
     </w:p>
     <w:p>
@@ -520,7 +520,7 @@
         <w:t>Title Music Continue</w:t>
       </w:r>
       <w:r>
-        <w:t xml:space="preserve">  [Music / High]</w:t>
+        <w:t xml:space="preserve">  [Ambience / High]</w:t>
       </w:r>
     </w:p>
     <w:p>
@@ -590,7 +590,7 @@
         <w:t>Campers Acapella Rock Snippet</w:t>
       </w:r>
       <w:r>
-        <w:t xml:space="preserve">  [Music / Medium]</w:t>
+        <w:t xml:space="preserve">  [Ambience / Medium]</w:t>
       </w:r>
     </w:p>
     <w:p>
@@ -1401,7 +1401,7 @@
         <w:t>Godspell Announcement Sting (Ref)</w:t>
       </w:r>
       <w:r>
-        <w:t xml:space="preserve">  [Music / Low]</w:t>
+        <w:t xml:space="preserve">  [Ambience / Low]</w:t>
       </w:r>
     </w:p>
     <w:p>
@@ -2575,7 +2575,7 @@
         <w:t>Love Is Alright Tonight (Rick Springfield)</w:t>
       </w:r>
       <w:r>
-        <w:t xml:space="preserve">  [Music / Critical]</w:t>
+        <w:t xml:space="preserve">  [Ambience / Critical]</w:t>
       </w:r>
     </w:p>
     <w:p>
@@ -3069,7 +3069,7 @@
         <w:t>Danny's Song (Loggins &amp; Messina)</w:t>
       </w:r>
       <w:r>
-        <w:t xml:space="preserve">  [Music / Critical]</w:t>
+        <w:t xml:space="preserve">  [Ambience / Critical]</w:t>
       </w:r>
     </w:p>
     <w:p>
@@ -3143,7 +3143,7 @@
         <w:t>Danny's Song (Tape Player Underscore)</w:t>
       </w:r>
       <w:r>
-        <w:t xml:space="preserve">  [Music / High]</w:t>
+        <w:t xml:space="preserve">  [Ambience / High]</w:t>
       </w:r>
     </w:p>
     <w:p>
@@ -3386,7 +3386,7 @@
         <w:t>Chase Sequence Underscore</w:t>
       </w:r>
       <w:r>
-        <w:t xml:space="preserve">  [Music / High]</w:t>
+        <w:t xml:space="preserve">  [Ambience / High]</w:t>
       </w:r>
     </w:p>
     <w:p>
@@ -3695,7 +3695,7 @@
         <w:t>Ceremony Flute Music</w:t>
       </w:r>
       <w:r>
-        <w:t xml:space="preserve">  [Music / High]</w:t>
+        <w:t xml:space="preserve">  [Ambience / High]</w:t>
       </w:r>
     </w:p>
     <w:p>
@@ -3806,7 +3806,7 @@
         <w:t>Flute Music Continue</w:t>
       </w:r>
       <w:r>
-        <w:t xml:space="preserve">  [Music / Medium]</w:t>
+        <w:t xml:space="preserve">  [Ambience / Medium]</w:t>
       </w:r>
     </w:p>
     <w:p>
@@ -4304,7 +4304,7 @@
         <w:t>Slo-Mo Sports Underscore</w:t>
       </w:r>
       <w:r>
-        <w:t xml:space="preserve">  [Music / Medium]</w:t>
+        <w:t xml:space="preserve">  [Ambience / Medium]</w:t>
       </w:r>
     </w:p>
     <w:p>
@@ -4947,7 +4947,7 @@
         <w:t>Summer in the City (Lovin' Spoonful)</w:t>
       </w:r>
       <w:r>
-        <w:t xml:space="preserve">  [Music / Critical]</w:t>
+        <w:t xml:space="preserve">  [Ambience / Critical]</w:t>
       </w:r>
     </w:p>
     <w:p>
@@ -5054,7 +5054,7 @@
         <w:t>Heartbreak Sting (Optional)</w:t>
       </w:r>
       <w:r>
-        <w:t xml:space="preserve">  [Music / Optional]</w:t>
+        <w:t xml:space="preserve">  [Ambience / Optional]</w:t>
       </w:r>
     </w:p>
     <w:p>
@@ -5396,7 +5396,7 @@
         <w:t>Ominous Drone Underscore</w:t>
       </w:r>
       <w:r>
-        <w:t xml:space="preserve">  [Music / High]</w:t>
+        <w:t xml:space="preserve">  [Ambience / High]</w:t>
       </w:r>
     </w:p>
     <w:p>
@@ -5680,7 +5680,7 @@
         <w:t>80s Training Montage Music</w:t>
       </w:r>
       <w:r>
-        <w:t xml:space="preserve">  [Music / Critical]</w:t>
+        <w:t xml:space="preserve">  [Ambience / Critical]</w:t>
       </w:r>
     </w:p>
     <w:p>
@@ -5787,7 +5787,7 @@
         <w:t>Montage Music Swell</w:t>
       </w:r>
       <w:r>
-        <w:t xml:space="preserve">  [Music / High]</w:t>
+        <w:t xml:space="preserve">  [Ambience / High]</w:t>
       </w:r>
     </w:p>
     <w:p>
@@ -6133,7 +6133,7 @@
         <w:t>Action Run Underscore</w:t>
       </w:r>
       <w:r>
-        <w:t xml:space="preserve">  [Music / Critical]</w:t>
+        <w:t xml:space="preserve">  [Ambience / Critical]</w:t>
       </w:r>
     </w:p>
     <w:p>
@@ -6619,7 +6619,7 @@
         <w:t>Symphonic Hope Crescendo</w:t>
       </w:r>
       <w:r>
-        <w:t xml:space="preserve">  [Music / High]</w:t>
+        <w:t xml:space="preserve">  [Ambience / High]</w:t>
       </w:r>
     </w:p>
     <w:p>
@@ -6800,7 +6800,7 @@
         <w:t>You've Got a Friend (Campers)</w:t>
       </w:r>
       <w:r>
-        <w:t xml:space="preserve">  [Music / Critical]</w:t>
+        <w:t xml:space="preserve">  [Ambience / Critical]</w:t>
       </w:r>
     </w:p>
     <w:p>
@@ -7109,7 +7109,7 @@
         <w:t>Day By Day (Godspell)</w:t>
       </w:r>
       <w:r>
-        <w:t xml:space="preserve">  [Music / Critical]</w:t>
+        <w:t xml:space="preserve">  [Ambience / Critical]</w:t>
       </w:r>
     </w:p>
     <w:p>
@@ -7562,7 +7562,7 @@
         <w:t>Emotional Music Swell</w:t>
       </w:r>
       <w:r>
-        <w:t xml:space="preserve">  [Music / High]</w:t>
+        <w:t xml:space="preserve">  [Ambience / High]</w:t>
       </w:r>
     </w:p>
     <w:p>
@@ -7776,7 +7776,7 @@
         <w:t>Romantic Kiss Stinger</w:t>
       </w:r>
       <w:r>
-        <w:t xml:space="preserve">  [Music / Medium]</w:t>
+        <w:t xml:space="preserve">  [Ambience / Medium]</w:t>
       </w:r>
     </w:p>
     <w:p>
@@ -7953,7 +7953,7 @@
         <w:t>Warm Morning Sting</w:t>
       </w:r>
       <w:r>
-        <w:t xml:space="preserve">  [Music / Medium]</w:t>
+        <w:t xml:space="preserve">  [Ambience / Medium]</w:t>
       </w:r>
     </w:p>
     <w:p>
@@ -7990,7 +7990,7 @@
         <w:t>Sentimental Underscore (Optional)</w:t>
       </w:r>
       <w:r>
-        <w:t xml:space="preserve">  [Music / Optional]</w:t>
+        <w:t xml:space="preserve">  [Ambience / Optional]</w:t>
       </w:r>
     </w:p>
     <w:p>
@@ -8192,7 +8192,7 @@
         <w:t>Gentle Ending Underscore</w:t>
       </w:r>
       <w:r>
-        <w:t xml:space="preserve">  [Music / High]</w:t>
+        <w:t xml:space="preserve">  [Ambience / High]</w:t>
       </w:r>
     </w:p>
     <w:p>
@@ -8365,7 +8365,7 @@
         <w:t>End Credits Music (Optional)</w:t>
       </w:r>
       <w:r>
-        <w:t xml:space="preserve">  [Music / Optional]</w:t>
+        <w:t xml:space="preserve">  [Ambience / Optional]</w:t>
       </w:r>
     </w:p>
     <w:p>

</xml_diff>